<commit_message>
Update AI Declaration Form
</commit_message>
<xml_diff>
--- a/AI Use Declaration Form.docx
+++ b/AI Use Declaration Form.docx
@@ -488,11 +488,11 @@
         <w:tblLook w:val="04A0" w:firstRow="1" w:lastRow="0" w:firstColumn="1" w:lastColumn="0" w:noHBand="0" w:noVBand="1"/>
       </w:tblPr>
       <w:tblGrid>
-        <w:gridCol w:w="831"/>
-        <w:gridCol w:w="1170"/>
-        <w:gridCol w:w="5014"/>
-        <w:gridCol w:w="1206"/>
-        <w:gridCol w:w="1129"/>
+        <w:gridCol w:w="809"/>
+        <w:gridCol w:w="1418"/>
+        <w:gridCol w:w="4835"/>
+        <w:gridCol w:w="1193"/>
+        <w:gridCol w:w="1095"/>
       </w:tblGrid>
       <w:tr>
         <w:tc>
@@ -918,8 +918,9 @@
                 <w:bCs/>
                 <w:lang w:val="en-RW"/>
               </w:rPr>
-              <w:t xml:space="preserve"> Virtual Environment: Active </w:t>
-            </w:r>
+              <w:t xml:space="preserve"> Virtual Environment: Active (C:\Users\</w:t>
+            </w:r>
+            <w:proofErr w:type="spellStart"/>
             <w:r>
               <w:rPr>
                 <w:rFonts w:ascii="Times New Roman" w:hAnsi="Times New Roman" w:cs="Times New Roman"/>
@@ -927,62 +928,52 @@
                 <w:bCs/>
                 <w:lang w:val="en-RW"/>
               </w:rPr>
+              <w:t>ingab</w:t>
+            </w:r>
+            <w:proofErr w:type="spellEnd"/>
+            <w:r>
+              <w:rPr>
+                <w:rFonts w:ascii="Times New Roman" w:hAnsi="Times New Roman" w:cs="Times New Roman"/>
+                <w:b/>
+                <w:bCs/>
+                <w:lang w:val="en-RW"/>
+              </w:rPr>
+              <w:t>\OneDrive\Desktop\Projects\</w:t>
+            </w:r>
+            <w:proofErr w:type="spellStart"/>
+            <w:r>
+              <w:rPr>
+                <w:rFonts w:ascii="Times New Roman" w:hAnsi="Times New Roman" w:cs="Times New Roman"/>
+                <w:b/>
+                <w:bCs/>
+                <w:lang w:val="en-RW"/>
+              </w:rPr>
+              <w:t>ai_env</w:t>
+            </w:r>
+            <w:proofErr w:type="spellEnd"/>
+            <w:r>
+              <w:rPr>
+                <w:rFonts w:ascii="Times New Roman" w:hAnsi="Times New Roman" w:cs="Times New Roman"/>
+                <w:b/>
+                <w:bCs/>
+                <w:lang w:val="en-RW"/>
+              </w:rPr>
+              <w:t>)</w:t>
+            </w:r>
+          </w:p>
+          <w:p>
+            <w:pPr>
+              <w:rPr>
+                <w:rFonts w:ascii="Times New Roman" w:hAnsi="Times New Roman" w:cs="Times New Roman"/>
+                <w:lang w:val="en-RW"/>
+              </w:rPr>
+            </w:pPr>
+            <w:r>
+              <w:rPr>
+                <w:rFonts w:ascii="Times New Roman" w:hAnsi="Times New Roman" w:cs="Times New Roman"/>
+                <w:lang w:val="en-RW"/>
+              </w:rPr>
               <w:lastRenderedPageBreak/>
-              <w:t>(C:\Users\</w:t>
-            </w:r>
-            <w:proofErr w:type="spellStart"/>
-            <w:r>
-              <w:rPr>
-                <w:rFonts w:ascii="Times New Roman" w:hAnsi="Times New Roman" w:cs="Times New Roman"/>
-                <w:b/>
-                <w:bCs/>
-                <w:lang w:val="en-RW"/>
-              </w:rPr>
-              <w:t>ingab</w:t>
-            </w:r>
-            <w:proofErr w:type="spellEnd"/>
-            <w:r>
-              <w:rPr>
-                <w:rFonts w:ascii="Times New Roman" w:hAnsi="Times New Roman" w:cs="Times New Roman"/>
-                <w:b/>
-                <w:bCs/>
-                <w:lang w:val="en-RW"/>
-              </w:rPr>
-              <w:t>\OneDrive\Desktop\Projects\</w:t>
-            </w:r>
-            <w:proofErr w:type="spellStart"/>
-            <w:r>
-              <w:rPr>
-                <w:rFonts w:ascii="Times New Roman" w:hAnsi="Times New Roman" w:cs="Times New Roman"/>
-                <w:b/>
-                <w:bCs/>
-                <w:lang w:val="en-RW"/>
-              </w:rPr>
-              <w:t>ai_env</w:t>
-            </w:r>
-            <w:proofErr w:type="spellEnd"/>
-            <w:r>
-              <w:rPr>
-                <w:rFonts w:ascii="Times New Roman" w:hAnsi="Times New Roman" w:cs="Times New Roman"/>
-                <w:b/>
-                <w:bCs/>
-                <w:lang w:val="en-RW"/>
-              </w:rPr>
-              <w:t>)</w:t>
-            </w:r>
-          </w:p>
-          <w:p>
-            <w:pPr>
-              <w:rPr>
-                <w:rFonts w:ascii="Times New Roman" w:hAnsi="Times New Roman" w:cs="Times New Roman"/>
-                <w:lang w:val="en-RW"/>
-              </w:rPr>
-            </w:pPr>
-            <w:r>
-              <w:rPr>
-                <w:rFonts w:ascii="Times New Roman" w:hAnsi="Times New Roman" w:cs="Times New Roman"/>
-                <w:lang w:val="en-RW"/>
-              </w:rPr>
               <w:t>(</w:t>
             </w:r>
             <w:proofErr w:type="spellStart"/>
@@ -1059,6 +1050,12 @@
                 <w:rFonts w:ascii="Times New Roman" w:hAnsi="Times New Roman" w:cs="Times New Roman"/>
               </w:rPr>
             </w:pPr>
+            <w:r>
+              <w:rPr>
+                <w:rFonts w:ascii="Times New Roman" w:hAnsi="Times New Roman" w:cs="Times New Roman"/>
+              </w:rPr>
+              <w:t>Claude AI</w:t>
+            </w:r>
           </w:p>
         </w:tc>
         <w:tc>
@@ -1071,6 +1068,12 @@
                 <w:rFonts w:ascii="Times New Roman" w:hAnsi="Times New Roman" w:cs="Times New Roman"/>
               </w:rPr>
             </w:pPr>
+            <w:r>
+              <w:rPr>
+                <w:rFonts w:ascii="Times New Roman" w:hAnsi="Times New Roman" w:cs="Times New Roman"/>
+              </w:rPr>
+              <w:t>How to change contents of README.md</w:t>
+            </w:r>
           </w:p>
         </w:tc>
         <w:tc>
@@ -1083,6 +1086,12 @@
                 <w:rFonts w:ascii="Times New Roman" w:hAnsi="Times New Roman" w:cs="Times New Roman"/>
               </w:rPr>
             </w:pPr>
+            <w:r>
+              <w:rPr>
+                <w:rFonts w:ascii="Times New Roman" w:hAnsi="Times New Roman" w:cs="Times New Roman"/>
+              </w:rPr>
+              <w:t>Help me update this:( what I want to change)</w:t>
+            </w:r>
           </w:p>
         </w:tc>
         <w:tc>
@@ -1095,6 +1104,12 @@
                 <w:rFonts w:ascii="Times New Roman" w:hAnsi="Times New Roman" w:cs="Times New Roman"/>
               </w:rPr>
             </w:pPr>
+            <w:r>
+              <w:rPr>
+                <w:rFonts w:ascii="Times New Roman" w:hAnsi="Times New Roman" w:cs="Times New Roman"/>
+              </w:rPr>
+              <w:t>Submission part</w:t>
+            </w:r>
           </w:p>
         </w:tc>
         <w:tc>
@@ -1107,6 +1122,12 @@
                 <w:rFonts w:ascii="Times New Roman" w:hAnsi="Times New Roman" w:cs="Times New Roman"/>
               </w:rPr>
             </w:pPr>
+            <w:r>
+              <w:rPr>
+                <w:rFonts w:ascii="Times New Roman" w:hAnsi="Times New Roman" w:cs="Times New Roman"/>
+              </w:rPr>
+              <w:t>Edited the given code to the way I wanted</w:t>
+            </w:r>
           </w:p>
         </w:tc>
       </w:tr>
@@ -2010,6 +2031,7 @@
           <w:b/>
           <w:bCs/>
         </w:rPr>
+        <w:lastRenderedPageBreak/>
         <w:t>Date:</w:t>
       </w:r>
       <w:r>
@@ -2067,8 +2089,8 @@
       <w:r>
         <w:rPr>
           <w:rFonts w:ascii="Times New Roman" w:hAnsi="Times New Roman" w:cs="Times New Roman"/>
-        </w:rPr>
-        <w:lastRenderedPageBreak/>
+          <w:noProof/>
+        </w:rPr>
         <w:drawing>
           <wp:inline distT="0" distB="0" distL="0" distR="0" wp14:anchorId="6E1FDEDA" wp14:editId="66CD613C">
             <wp:extent cx="5943600" cy="2679700"/>
@@ -2115,6 +2137,7 @@
       <w:r>
         <w:rPr>
           <w:rFonts w:ascii="Times New Roman" w:hAnsi="Times New Roman" w:cs="Times New Roman"/>
+          <w:noProof/>
         </w:rPr>
         <w:drawing>
           <wp:inline distT="0" distB="0" distL="0" distR="0" wp14:anchorId="6908760B" wp14:editId="455FEDB5">
@@ -2162,7 +2185,9 @@
       <w:r>
         <w:rPr>
           <w:rFonts w:ascii="Times New Roman" w:hAnsi="Times New Roman" w:cs="Times New Roman"/>
-        </w:rPr>
+          <w:noProof/>
+        </w:rPr>
+        <w:lastRenderedPageBreak/>
         <w:drawing>
           <wp:inline distT="0" distB="0" distL="0" distR="0" wp14:anchorId="5B66B511" wp14:editId="74804BA3">
             <wp:extent cx="5943600" cy="2169160"/>
@@ -2209,8 +2234,8 @@
       <w:r>
         <w:rPr>
           <w:rFonts w:ascii="Times New Roman" w:hAnsi="Times New Roman" w:cs="Times New Roman"/>
-        </w:rPr>
-        <w:lastRenderedPageBreak/>
+          <w:noProof/>
+        </w:rPr>
         <w:drawing>
           <wp:inline distT="0" distB="0" distL="0" distR="0" wp14:anchorId="137F6CC5" wp14:editId="7038BC94">
             <wp:extent cx="5943600" cy="2597150"/>
@@ -2252,11 +2277,13 @@
       <w:pPr>
         <w:rPr>
           <w:rFonts w:ascii="Times New Roman" w:hAnsi="Times New Roman" w:cs="Times New Roman"/>
+          <w:noProof/>
         </w:rPr>
       </w:pPr>
       <w:r>
         <w:rPr>
           <w:rFonts w:ascii="Times New Roman" w:hAnsi="Times New Roman" w:cs="Times New Roman"/>
+          <w:noProof/>
         </w:rPr>
         <w:drawing>
           <wp:inline distT="0" distB="0" distL="0" distR="0" wp14:anchorId="68643EFB" wp14:editId="0BF5F259">
@@ -2283,6 +2310,65 @@
                     <a:xfrm>
                       <a:off x="0" y="0"/>
                       <a:ext cx="5943600" cy="2379980"/>
+                    </a:xfrm>
+                    <a:prstGeom prst="rect">
+                      <a:avLst/>
+                    </a:prstGeom>
+                  </pic:spPr>
+                </pic:pic>
+              </a:graphicData>
+            </a:graphic>
+          </wp:inline>
+        </w:drawing>
+      </w:r>
+    </w:p>
+    <w:p>
+      <w:pPr>
+        <w:rPr>
+          <w:rFonts w:ascii="Times New Roman" w:hAnsi="Times New Roman" w:cs="Times New Roman"/>
+          <w:noProof/>
+        </w:rPr>
+      </w:pPr>
+    </w:p>
+    <w:p>
+      <w:pPr>
+        <w:tabs>
+          <w:tab w:val="left" w:pos="5590"/>
+        </w:tabs>
+        <w:rPr>
+          <w:rFonts w:ascii="Times New Roman" w:hAnsi="Times New Roman" w:cs="Times New Roman"/>
+        </w:rPr>
+      </w:pPr>
+      <w:r>
+        <w:rPr>
+          <w:rFonts w:ascii="Times New Roman" w:hAnsi="Times New Roman" w:cs="Times New Roman"/>
+        </w:rPr>
+        <w:lastRenderedPageBreak/>
+        <w:drawing>
+          <wp:inline distT="0" distB="0" distL="0" distR="0" wp14:anchorId="4BF3F3F1" wp14:editId="16235A6E">
+            <wp:extent cx="5943600" cy="2712085"/>
+            <wp:effectExtent l="0" t="0" r="0" b="0"/>
+            <wp:docPr id="1707869571" name="Picture 1"/>
+            <wp:cNvGraphicFramePr>
+              <a:graphicFrameLocks xmlns:a="http://schemas.openxmlformats.org/drawingml/2006/main" noChangeAspect="1"/>
+            </wp:cNvGraphicFramePr>
+            <a:graphic xmlns:a="http://schemas.openxmlformats.org/drawingml/2006/main">
+              <a:graphicData uri="http://schemas.openxmlformats.org/drawingml/2006/picture">
+                <pic:pic xmlns:pic="http://schemas.openxmlformats.org/drawingml/2006/picture">
+                  <pic:nvPicPr>
+                    <pic:cNvPr id="1707869571" name=""/>
+                    <pic:cNvPicPr/>
+                  </pic:nvPicPr>
+                  <pic:blipFill>
+                    <a:blip r:embed="rId9"/>
+                    <a:stretch>
+                      <a:fillRect/>
+                    </a:stretch>
+                  </pic:blipFill>
+                  <pic:spPr>
+                    <a:xfrm>
+                      <a:off x="0" y="0"/>
+                      <a:ext cx="5943600" cy="2712085"/>
                     </a:xfrm>
                     <a:prstGeom prst="rect">
                       <a:avLst/>
@@ -2908,6 +2994,7 @@
   <w:style w:type="character" w:default="1" w:styleId="DefaultParagraphFont">
     <w:name w:val="Default Paragraph Font"/>
     <w:uiPriority w:val="1"/>
+    <w:semiHidden/>
     <w:unhideWhenUsed/>
   </w:style>
   <w:style w:type="table" w:default="1" w:styleId="TableNormal">

</xml_diff>